<commit_message>
Privacy policy page, site index, app-ads.txt, signed release config, GMA 1.6.0
</commit_message>
<xml_diff>
--- a/play-store/sortpuzzle/Tidy Tubes - Fiche Google Play.docx
+++ b/play-store/sortpuzzle/Tidy Tubes - Fiche Google Play.docx
@@ -254,7 +254,7 @@
           </w:tcPr>
           <w:p>
             <w:r>
-              <w:t>&lt;à compléter : e-mail affiché sur la fiche&gt;</w:t>
+              <w:t>hbenlaama1997@gmail.com</w:t>
             </w:r>
           </w:p>
         </w:tc>
@@ -282,7 +282,7 @@
           </w:tcPr>
           <w:p>
             <w:r>
-              <w:t>&lt;à compléter : site web du développeur (requis pour publier app-ads.txt)&gt;</w:t>
+              <w:t>https://innocraftcode.github.io/Tidy-Tubes/ (GitHub Pages du dépôt ; y publier app-ads.txt à la racine pour AdMob)</w:t>
             </w:r>
           </w:p>
         </w:tc>
@@ -310,7 +310,7 @@
           </w:tcPr>
           <w:p>
             <w:r>
-              <w:t>&lt;à compléter : URL publique de la politique de confidentialité (obligatoire ; doit mentionner AdMob et l'identifiant publicitaire)&gt;</w:t>
+              <w:t>https://innocraftcode.github.io/Tidy-Tubes/privacy-policy/ (fichier privacy-policy/index.html du dépôt ; activer GitHub Pages sur main / racine, puis vérifier que l'URL répond avant de la saisir dans Play Console)</w:t>
             </w:r>
           </w:p>
         </w:tc>
@@ -406,13 +406,13 @@
         <w:pStyle w:val="Heading1"/>
       </w:pPr>
       <w:r>
-        <w:lastRenderedPageBreak/>
         <w:t>Éléments graphiques</w:t>
       </w:r>
     </w:p>
     <w:tbl>
       <w:tblPr>
         <w:tblW w:w="8844" w:type="dxa"/>
+        <w:tblInd w:w="-5" w:type="dxa"/>
         <w:tblBorders>
           <w:top w:val="single" w:sz="4" w:space="0" w:color="auto"/>
           <w:left w:val="single" w:sz="4" w:space="0" w:color="auto"/>
@@ -726,16 +726,16 @@
           <w:noProof/>
         </w:rPr>
         <w:drawing>
-          <wp:inline distT="0" distB="0" distL="0" distR="0" wp14:anchorId="0979AEFF" wp14:editId="3039DE0D">
+          <wp:inline distT="0" distB="0" distL="0" distR="0" wp14:anchorId="7F890511" wp14:editId="317ECE93">
             <wp:extent cx="1440000" cy="1439545"/>
             <wp:effectExtent l="0" t="0" r="8255" b="8255"/>
-            <wp:docPr id="2071283565" name="Picture 1"/>
+            <wp:docPr id="1659946712" name="Picture 1"/>
             <wp:cNvGraphicFramePr/>
             <a:graphic xmlns:a="http://schemas.openxmlformats.org/drawingml/2006/main">
               <a:graphicData uri="http://schemas.openxmlformats.org/drawingml/2006/picture">
                 <pic:pic xmlns:pic="http://schemas.openxmlformats.org/drawingml/2006/picture">
                   <pic:nvPicPr>
-                    <pic:cNvPr id="2071283565" name=""/>
+                    <pic:cNvPr id="1659946712" name=""/>
                     <pic:cNvPicPr/>
                   </pic:nvPicPr>
                   <pic:blipFill>
@@ -771,6 +771,7 @@
         <w:pStyle w:val="Heading2"/>
       </w:pPr>
       <w:r>
+        <w:lastRenderedPageBreak/>
         <w:t>Image de présentation</w:t>
       </w:r>
     </w:p>
@@ -780,16 +781,16 @@
           <w:noProof/>
         </w:rPr>
         <w:drawing>
-          <wp:inline distT="0" distB="0" distL="0" distR="0" wp14:anchorId="108208AF" wp14:editId="76EE2257">
+          <wp:inline distT="0" distB="0" distL="0" distR="0" wp14:anchorId="17FDF3A3" wp14:editId="34F131FD">
             <wp:extent cx="5400000" cy="2636614"/>
             <wp:effectExtent l="0" t="0" r="0" b="0"/>
-            <wp:docPr id="597590868" name="Picture 2"/>
+            <wp:docPr id="86330660" name="Picture 2"/>
             <wp:cNvGraphicFramePr/>
             <a:graphic xmlns:a="http://schemas.openxmlformats.org/drawingml/2006/main">
               <a:graphicData uri="http://schemas.openxmlformats.org/drawingml/2006/picture">
                 <pic:pic xmlns:pic="http://schemas.openxmlformats.org/drawingml/2006/picture">
                   <pic:nvPicPr>
-                    <pic:cNvPr id="597590868" name=""/>
+                    <pic:cNvPr id="86330660" name=""/>
                     <pic:cNvPicPr/>
                   </pic:nvPicPr>
                   <pic:blipFill>
@@ -822,7 +823,6 @@
     </w:p>
     <w:p>
       <w:r>
-        <w:lastRenderedPageBreak/>
         <w:t>Les visuels générés sont des brouillons aux couleurs du jeu : remplacez-les par des créations définitives quand vous les avez (mêmes noms, mêmes tailles).</w:t>
       </w:r>
     </w:p>
@@ -2134,7 +2134,7 @@
     <w:link w:val="Heading1Char"/>
     <w:uiPriority w:val="9"/>
     <w:qFormat/>
-    <w:rsid w:val="00DF5D79"/>
+    <w:rsid w:val="00A34D18"/>
     <w:pPr>
       <w:keepNext/>
       <w:keepLines/>
@@ -2156,7 +2156,7 @@
     <w:uiPriority w:val="9"/>
     <w:unhideWhenUsed/>
     <w:qFormat/>
-    <w:rsid w:val="00DF5D79"/>
+    <w:rsid w:val="00A34D18"/>
     <w:pPr>
       <w:keepNext/>
       <w:keepLines/>
@@ -2179,7 +2179,7 @@
     <w:semiHidden/>
     <w:unhideWhenUsed/>
     <w:qFormat/>
-    <w:rsid w:val="00DF5D79"/>
+    <w:rsid w:val="00A34D18"/>
     <w:pPr>
       <w:keepNext/>
       <w:keepLines/>
@@ -2202,7 +2202,7 @@
     <w:semiHidden/>
     <w:unhideWhenUsed/>
     <w:qFormat/>
-    <w:rsid w:val="00DF5D79"/>
+    <w:rsid w:val="00A34D18"/>
     <w:pPr>
       <w:keepNext/>
       <w:keepLines/>
@@ -2225,7 +2225,7 @@
     <w:semiHidden/>
     <w:unhideWhenUsed/>
     <w:qFormat/>
-    <w:rsid w:val="00DF5D79"/>
+    <w:rsid w:val="00A34D18"/>
     <w:pPr>
       <w:keepNext/>
       <w:keepLines/>
@@ -2246,7 +2246,7 @@
     <w:semiHidden/>
     <w:unhideWhenUsed/>
     <w:qFormat/>
-    <w:rsid w:val="00DF5D79"/>
+    <w:rsid w:val="00A34D18"/>
     <w:pPr>
       <w:keepNext/>
       <w:keepLines/>
@@ -2269,7 +2269,7 @@
     <w:semiHidden/>
     <w:unhideWhenUsed/>
     <w:qFormat/>
-    <w:rsid w:val="00DF5D79"/>
+    <w:rsid w:val="00A34D18"/>
     <w:pPr>
       <w:keepNext/>
       <w:keepLines/>
@@ -2290,7 +2290,7 @@
     <w:semiHidden/>
     <w:unhideWhenUsed/>
     <w:qFormat/>
-    <w:rsid w:val="00DF5D79"/>
+    <w:rsid w:val="00A34D18"/>
     <w:pPr>
       <w:keepNext/>
       <w:keepLines/>
@@ -2313,7 +2313,7 @@
     <w:semiHidden/>
     <w:unhideWhenUsed/>
     <w:qFormat/>
-    <w:rsid w:val="00DF5D79"/>
+    <w:rsid w:val="00A34D18"/>
     <w:pPr>
       <w:keepNext/>
       <w:keepLines/>
@@ -2357,7 +2357,7 @@
     <w:basedOn w:val="DefaultParagraphFont"/>
     <w:link w:val="Heading1"/>
     <w:uiPriority w:val="9"/>
-    <w:rsid w:val="00DF5D79"/>
+    <w:rsid w:val="00A34D18"/>
     <w:rPr>
       <w:rFonts w:asciiTheme="majorHAnsi" w:eastAsiaTheme="majorEastAsia" w:hAnsiTheme="majorHAnsi" w:cstheme="majorBidi"/>
       <w:color w:val="0F4761" w:themeColor="accent1" w:themeShade="BF"/>
@@ -2370,7 +2370,7 @@
     <w:basedOn w:val="DefaultParagraphFont"/>
     <w:link w:val="Heading2"/>
     <w:uiPriority w:val="9"/>
-    <w:rsid w:val="00DF5D79"/>
+    <w:rsid w:val="00A34D18"/>
     <w:rPr>
       <w:rFonts w:asciiTheme="majorHAnsi" w:eastAsiaTheme="majorEastAsia" w:hAnsiTheme="majorHAnsi" w:cstheme="majorBidi"/>
       <w:color w:val="0F4761" w:themeColor="accent1" w:themeShade="BF"/>
@@ -2384,7 +2384,7 @@
     <w:link w:val="Heading3"/>
     <w:uiPriority w:val="9"/>
     <w:semiHidden/>
-    <w:rsid w:val="00DF5D79"/>
+    <w:rsid w:val="00A34D18"/>
     <w:rPr>
       <w:rFonts w:eastAsiaTheme="majorEastAsia" w:cstheme="majorBidi"/>
       <w:color w:val="0F4761" w:themeColor="accent1" w:themeShade="BF"/>
@@ -2398,7 +2398,7 @@
     <w:link w:val="Heading4"/>
     <w:uiPriority w:val="9"/>
     <w:semiHidden/>
-    <w:rsid w:val="00DF5D79"/>
+    <w:rsid w:val="00A34D18"/>
     <w:rPr>
       <w:rFonts w:eastAsiaTheme="majorEastAsia" w:cstheme="majorBidi"/>
       <w:i/>
@@ -2412,7 +2412,7 @@
     <w:link w:val="Heading5"/>
     <w:uiPriority w:val="9"/>
     <w:semiHidden/>
-    <w:rsid w:val="00DF5D79"/>
+    <w:rsid w:val="00A34D18"/>
     <w:rPr>
       <w:rFonts w:eastAsiaTheme="majorEastAsia" w:cstheme="majorBidi"/>
       <w:color w:val="0F4761" w:themeColor="accent1" w:themeShade="BF"/>
@@ -2424,7 +2424,7 @@
     <w:link w:val="Heading6"/>
     <w:uiPriority w:val="9"/>
     <w:semiHidden/>
-    <w:rsid w:val="00DF5D79"/>
+    <w:rsid w:val="00A34D18"/>
     <w:rPr>
       <w:rFonts w:eastAsiaTheme="majorEastAsia" w:cstheme="majorBidi"/>
       <w:i/>
@@ -2438,7 +2438,7 @@
     <w:link w:val="Heading7"/>
     <w:uiPriority w:val="9"/>
     <w:semiHidden/>
-    <w:rsid w:val="00DF5D79"/>
+    <w:rsid w:val="00A34D18"/>
     <w:rPr>
       <w:rFonts w:eastAsiaTheme="majorEastAsia" w:cstheme="majorBidi"/>
       <w:color w:val="595959" w:themeColor="text1" w:themeTint="A6"/>
@@ -2450,7 +2450,7 @@
     <w:link w:val="Heading8"/>
     <w:uiPriority w:val="9"/>
     <w:semiHidden/>
-    <w:rsid w:val="00DF5D79"/>
+    <w:rsid w:val="00A34D18"/>
     <w:rPr>
       <w:rFonts w:eastAsiaTheme="majorEastAsia" w:cstheme="majorBidi"/>
       <w:i/>
@@ -2464,7 +2464,7 @@
     <w:link w:val="Heading9"/>
     <w:uiPriority w:val="9"/>
     <w:semiHidden/>
-    <w:rsid w:val="00DF5D79"/>
+    <w:rsid w:val="00A34D18"/>
     <w:rPr>
       <w:rFonts w:eastAsiaTheme="majorEastAsia" w:cstheme="majorBidi"/>
       <w:color w:val="272727" w:themeColor="text1" w:themeTint="D8"/>
@@ -2477,7 +2477,7 @@
     <w:link w:val="TitleChar"/>
     <w:uiPriority w:val="10"/>
     <w:qFormat/>
-    <w:rsid w:val="00DF5D79"/>
+    <w:rsid w:val="00A34D18"/>
     <w:pPr>
       <w:spacing w:after="80" w:line="240" w:lineRule="auto"/>
       <w:contextualSpacing/>
@@ -2495,7 +2495,7 @@
     <w:basedOn w:val="DefaultParagraphFont"/>
     <w:link w:val="Title"/>
     <w:uiPriority w:val="10"/>
-    <w:rsid w:val="00DF5D79"/>
+    <w:rsid w:val="00A34D18"/>
     <w:rPr>
       <w:rFonts w:asciiTheme="majorHAnsi" w:eastAsiaTheme="majorEastAsia" w:hAnsiTheme="majorHAnsi" w:cstheme="majorBidi"/>
       <w:spacing w:val="-10"/>
@@ -2511,7 +2511,7 @@
     <w:link w:val="SubtitleChar"/>
     <w:uiPriority w:val="11"/>
     <w:qFormat/>
-    <w:rsid w:val="00DF5D79"/>
+    <w:rsid w:val="00A34D18"/>
     <w:pPr>
       <w:numPr>
         <w:ilvl w:val="1"/>
@@ -2530,7 +2530,7 @@
     <w:basedOn w:val="DefaultParagraphFont"/>
     <w:link w:val="Subtitle"/>
     <w:uiPriority w:val="11"/>
-    <w:rsid w:val="00DF5D79"/>
+    <w:rsid w:val="00A34D18"/>
     <w:rPr>
       <w:rFonts w:eastAsiaTheme="majorEastAsia" w:cstheme="majorBidi"/>
       <w:color w:val="595959" w:themeColor="text1" w:themeTint="A6"/>
@@ -2546,7 +2546,7 @@
     <w:link w:val="QuoteChar"/>
     <w:uiPriority w:val="29"/>
     <w:qFormat/>
-    <w:rsid w:val="00DF5D79"/>
+    <w:rsid w:val="00A34D18"/>
     <w:pPr>
       <w:spacing w:before="160"/>
       <w:jc w:val="center"/>
@@ -2562,7 +2562,7 @@
     <w:basedOn w:val="DefaultParagraphFont"/>
     <w:link w:val="Quote"/>
     <w:uiPriority w:val="29"/>
-    <w:rsid w:val="00DF5D79"/>
+    <w:rsid w:val="00A34D18"/>
     <w:rPr>
       <w:i/>
       <w:iCs/>
@@ -2574,7 +2574,7 @@
     <w:basedOn w:val="Normal"/>
     <w:uiPriority w:val="34"/>
     <w:qFormat/>
-    <w:rsid w:val="00DF5D79"/>
+    <w:rsid w:val="00A34D18"/>
     <w:pPr>
       <w:ind w:left="720"/>
       <w:contextualSpacing/>
@@ -2585,7 +2585,7 @@
     <w:basedOn w:val="DefaultParagraphFont"/>
     <w:uiPriority w:val="21"/>
     <w:qFormat/>
-    <w:rsid w:val="00DF5D79"/>
+    <w:rsid w:val="00A34D18"/>
     <w:rPr>
       <w:i/>
       <w:iCs/>
@@ -2599,7 +2599,7 @@
     <w:link w:val="IntenseQuoteChar"/>
     <w:uiPriority w:val="30"/>
     <w:qFormat/>
-    <w:rsid w:val="00DF5D79"/>
+    <w:rsid w:val="00A34D18"/>
     <w:pPr>
       <w:pBdr>
         <w:top w:val="single" w:sz="4" w:space="10" w:color="0F4761" w:themeColor="accent1" w:themeShade="BF"/>
@@ -2620,7 +2620,7 @@
     <w:basedOn w:val="DefaultParagraphFont"/>
     <w:link w:val="IntenseQuote"/>
     <w:uiPriority w:val="30"/>
-    <w:rsid w:val="00DF5D79"/>
+    <w:rsid w:val="00A34D18"/>
     <w:rPr>
       <w:i/>
       <w:iCs/>
@@ -2632,7 +2632,7 @@
     <w:basedOn w:val="DefaultParagraphFont"/>
     <w:uiPriority w:val="32"/>
     <w:qFormat/>
-    <w:rsid w:val="00DF5D79"/>
+    <w:rsid w:val="00A34D18"/>
     <w:rPr>
       <w:b/>
       <w:bCs/>

</xml_diff>